<commit_message>
fix: campos de despesas como text_area, scroll-to-top robusto, cap de horas e ajuste do template
</commit_message>
<xml_diff>
--- a/resources/templates/PMRA_Escopo_Misto.docx
+++ b/resources/templates/PMRA_Escopo_Misto.docx
@@ -977,6 +977,18 @@
         </w:rPr>
         <w:t>{{#INSTRUCAO}}Seletor SIM/NÃO — SLA. Se SIM: incluir a seção SLA e a tabela de Prazos de Entrega. Se NÃO: excluir integralmente a seção SLA.{{/INSTRUCAO}}</w:t>
       </w:r>
+    </w:p>
+    <w:p>
+      <w:pPr>
+        <w:keepNext/>
+        <w:snapToGrid w:val="0"/>
+        <w:rPr>
+          <w:b/>
+          <w:bCs/>
+          <w:sz w:val="20"/>
+          <w:szCs w:val="20"/>
+        </w:rPr>
+      </w:pPr>
     </w:p>
     <w:p>
       <w:pPr>
@@ -2026,7 +2038,6 @@
                 <w:sz w:val="20"/>
                 <w:szCs w:val="20"/>
               </w:rPr>
-              <w:lastRenderedPageBreak/>
               <w:t>Valor Mensal</w:t>
             </w:r>
           </w:p>
@@ -2133,7 +2144,14 @@
                 <w:sz w:val="20"/>
                 <w:szCs w:val="20"/>
               </w:rPr>
-              <w:t>{{R$ XXXX,XX}}</w:t>
+              <w:t>{{Inserir número}}</w:t>
+            </w:r>
+            <w:r>
+              <w:rPr>
+                <w:sz w:val="20"/>
+                <w:szCs w:val="20"/>
+              </w:rPr>
+              <w:t xml:space="preserve"> horas</w:t>
             </w:r>
           </w:p>
         </w:tc>
@@ -3275,6 +3293,7 @@
                 <w:sz w:val="20"/>
                 <w:szCs w:val="20"/>
               </w:rPr>
+              <w:lastRenderedPageBreak/>
               <w:t>Contestação</w:t>
             </w:r>
           </w:p>
@@ -3381,7 +3400,6 @@
                 <w:sz w:val="20"/>
                 <w:szCs w:val="20"/>
               </w:rPr>
-              <w:lastRenderedPageBreak/>
               <w:t>Recurso Ordinário</w:t>
             </w:r>
           </w:p>
@@ -4739,6 +4757,7 @@
           <w:sz w:val="20"/>
           <w:szCs w:val="20"/>
         </w:rPr>
+        <w:lastRenderedPageBreak/>
         <w:t>Honorários de Êxito</w:t>
       </w:r>
     </w:p>
@@ -4766,15 +4785,7 @@
           <w:sz w:val="20"/>
           <w:szCs w:val="20"/>
         </w:rPr>
-        <w:t xml:space="preserve">Os honorários de êxito são devidos ao Contratado quando verificado resultado favorável ao Contratante, assim entendido o benefício econômico efetivo ou a vantagem jurídica concreta decorrente da atuação contenciosa, aferido por decisão judicial transitada em </w:t>
-      </w:r>
-      <w:r>
-        <w:rPr>
-          <w:sz w:val="20"/>
-          <w:szCs w:val="20"/>
-        </w:rPr>
-        <w:lastRenderedPageBreak/>
-        <w:t>julgado, homologação de acordo, decisão arbitral definitiva ou decisão administrativa irrecorrível. O percentual incidirá sobre a base de cálculo definida abaixo, com vínculo causal direto à atuação do Contratado, sendo devidos integralmente ainda que o resultado definitivo sobrevenha após o encerramento desta Proposta, nos termos do artigo 22, §§ 1º e 2º, da Lei n. 8.906/1994.</w:t>
+        <w:t>Os honorários de êxito são devidos ao Contratado quando verificado resultado favorável ao Contratante, assim entendido o benefício econômico efetivo ou a vantagem jurídica concreta decorrente da atuação contenciosa, aferido por decisão judicial transitada em julgado, homologação de acordo, decisão arbitral definitiva ou decisão administrativa irrecorrível. O percentual incidirá sobre a base de cálculo definida abaixo, com vínculo causal direto à atuação do Contratado, sendo devidos integralmente ainda que o resultado definitivo sobrevenha após o encerramento desta Proposta, nos termos do artigo 22, §§ 1º e 2º, da Lei n. 8.906/1994.</w:t>
       </w:r>
     </w:p>
     <w:p>
@@ -5966,6 +5977,7 @@
                 <w:sz w:val="20"/>
                 <w:szCs w:val="20"/>
               </w:rPr>
+              <w:lastRenderedPageBreak/>
               <w:t xml:space="preserve">Despesas </w:t>
             </w:r>
             <w:r>
@@ -6119,7 +6131,6 @@
                 <w:sz w:val="20"/>
                 <w:szCs w:val="20"/>
               </w:rPr>
-              <w:lastRenderedPageBreak/>
               <w:t>Taxa de Manutenção Processual</w:t>
             </w:r>
             <w:r>
@@ -7058,6 +7069,7 @@
           <w:sz w:val="20"/>
           <w:szCs w:val="20"/>
         </w:rPr>
+        <w:lastRenderedPageBreak/>
         <w:t xml:space="preserve">O inadimplemento de qualquer obrigação pecuniária prevista </w:t>
       </w:r>
       <w:r>
@@ -7877,6 +7889,7 @@
           <w:sz w:val="20"/>
           <w:szCs w:val="20"/>
         </w:rPr>
+        <w:lastRenderedPageBreak/>
         <w:t>Emitir os documentos fiscais correspondentes aos honorários e despesas cobrados, na forma da legislação tributária aplicável.</w:t>
       </w:r>
     </w:p>
@@ -7910,7 +7923,6 @@
           <w:sz w:val="20"/>
           <w:szCs w:val="20"/>
         </w:rPr>
-        <w:lastRenderedPageBreak/>
         <w:t>DAS OBRIGAÇÕES DA CONTRATANTE</w:t>
       </w:r>
     </w:p>
@@ -8449,6 +8461,7 @@
           <w:sz w:val="20"/>
           <w:szCs w:val="20"/>
         </w:rPr>
+        <w:lastRenderedPageBreak/>
         <w:t>As obrigações desta cláusula s</w:t>
       </w:r>
       <w:r>
@@ -8510,7 +8523,6 @@
           <w:sz w:val="20"/>
           <w:szCs w:val="20"/>
         </w:rPr>
-        <w:lastRenderedPageBreak/>
         <w:t>DA PROTEÇÃO DE DADOS PESSOAIS</w:t>
       </w:r>
     </w:p>
@@ -9051,6 +9063,7 @@
           <w:sz w:val="20"/>
           <w:szCs w:val="20"/>
         </w:rPr>
+        <w:lastRenderedPageBreak/>
         <w:t>A presente Proposta</w:t>
       </w:r>
       <w:r>
@@ -10818,6 +10831,26 @@
 </file>
 
 <file path=customXml/item1.xml><?xml version="1.0" encoding="utf-8"?>
+<p:properties xmlns:p="http://schemas.microsoft.com/office/2006/metadata/properties" xmlns:xsi="http://www.w3.org/2001/XMLSchema-instance" xmlns:pc="http://schemas.microsoft.com/office/infopath/2007/PartnerControls">
+  <documentManagement>
+    <lcf76f155ced4ddcb4097134ff3c332f xmlns="e5b1cd33-4eca-41a4-b7d8-fdf3e6200119">
+      <Terms xmlns="http://schemas.microsoft.com/office/infopath/2007/PartnerControls"/>
+    </lcf76f155ced4ddcb4097134ff3c332f>
+    <TaxCatchAll xmlns="c710a95f-4097-48d0-b72e-528dcf24b561" xsi:nil="true"/>
+  </documentManagement>
+</p:properties>
+</file>
+
+<file path=customXml/item2.xml><?xml version="1.0" encoding="utf-8"?>
+<?mso-contentType ?>
+<FormTemplates xmlns="http://schemas.microsoft.com/sharepoint/v3/contenttype/forms">
+  <Display>DocumentLibraryForm</Display>
+  <Edit>DocumentLibraryForm</Edit>
+  <New>DocumentLibraryForm</New>
+</FormTemplates>
+</file>
+
+<file path=customXml/item3.xml><?xml version="1.0" encoding="utf-8"?>
 <ct:contentTypeSchema xmlns:ct="http://schemas.microsoft.com/office/2006/metadata/contentType" xmlns:ma="http://schemas.microsoft.com/office/2006/metadata/properties/metaAttributes" ct:_="" ma:_="" ma:contentTypeName="Documento" ma:contentTypeID="0x010100C538FE3DE9F5C249B208F757A39C9CF1" ma:contentTypeVersion="13" ma:contentTypeDescription="Crie um novo documento." ma:contentTypeScope="" ma:versionID="f58841031a2b8acc55807e179e1eb129">
   <xsd:schema xmlns:xsd="http://www.w3.org/2001/XMLSchema" xmlns:xs="http://www.w3.org/2001/XMLSchema" xmlns:p="http://schemas.microsoft.com/office/2006/metadata/properties" xmlns:ns2="e5b1cd33-4eca-41a4-b7d8-fdf3e6200119" xmlns:ns3="c710a95f-4097-48d0-b72e-528dcf24b561" targetNamespace="http://schemas.microsoft.com/office/2006/metadata/properties" ma:root="true" ma:fieldsID="eabb80da9e4a7645788b9624de58e5c8" ns2:_="" ns3:_="">
     <xsd:import namespace="e5b1cd33-4eca-41a4-b7d8-fdf3e6200119"/>
@@ -11024,27 +11057,26 @@
 </ct:contentTypeSchema>
 </file>
 
-<file path=customXml/item2.xml><?xml version="1.0" encoding="utf-8"?>
-<p:properties xmlns:p="http://schemas.microsoft.com/office/2006/metadata/properties" xmlns:xsi="http://www.w3.org/2001/XMLSchema-instance" xmlns:pc="http://schemas.microsoft.com/office/infopath/2007/PartnerControls">
-  <documentManagement>
-    <lcf76f155ced4ddcb4097134ff3c332f xmlns="e5b1cd33-4eca-41a4-b7d8-fdf3e6200119">
-      <Terms xmlns="http://schemas.microsoft.com/office/infopath/2007/PartnerControls"/>
-    </lcf76f155ced4ddcb4097134ff3c332f>
-    <TaxCatchAll xmlns="c710a95f-4097-48d0-b72e-528dcf24b561" xsi:nil="true"/>
-  </documentManagement>
-</p:properties>
+<file path=customXml/itemProps1.xml><?xml version="1.0" encoding="utf-8"?>
+<ds:datastoreItem xmlns:ds="http://schemas.openxmlformats.org/officeDocument/2006/customXml" ds:itemID="{CB7613A1-A0CB-4E22-AF85-27793339D14D}">
+  <ds:schemaRefs>
+    <ds:schemaRef ds:uri="http://schemas.microsoft.com/office/2006/metadata/properties"/>
+    <ds:schemaRef ds:uri="http://schemas.microsoft.com/office/infopath/2007/PartnerControls"/>
+    <ds:schemaRef ds:uri="e5b1cd33-4eca-41a4-b7d8-fdf3e6200119"/>
+    <ds:schemaRef ds:uri="c710a95f-4097-48d0-b72e-528dcf24b561"/>
+  </ds:schemaRefs>
+</ds:datastoreItem>
 </file>
 
-<file path=customXml/item3.xml><?xml version="1.0" encoding="utf-8"?>
-<?mso-contentType ?>
-<FormTemplates xmlns="http://schemas.microsoft.com/sharepoint/v3/contenttype/forms">
-  <Display>DocumentLibraryForm</Display>
-  <Edit>DocumentLibraryForm</Edit>
-  <New>DocumentLibraryForm</New>
-</FormTemplates>
+<file path=customXml/itemProps2.xml><?xml version="1.0" encoding="utf-8"?>
+<ds:datastoreItem xmlns:ds="http://schemas.openxmlformats.org/officeDocument/2006/customXml" ds:itemID="{A5ED3DFB-4F39-4BF8-995C-27FE2C86527B}">
+  <ds:schemaRefs>
+    <ds:schemaRef ds:uri="http://schemas.microsoft.com/sharepoint/v3/contenttype/forms"/>
+  </ds:schemaRefs>
+</ds:datastoreItem>
 </file>
 
-<file path=customXml/itemProps1.xml><?xml version="1.0" encoding="utf-8"?>
+<file path=customXml/itemProps3.xml><?xml version="1.0" encoding="utf-8"?>
 <ds:datastoreItem xmlns:ds="http://schemas.openxmlformats.org/officeDocument/2006/customXml" ds:itemID="{527C8FAF-F895-460C-92FD-63B7C6027339}">
   <ds:schemaRefs>
     <ds:schemaRef ds:uri="http://schemas.microsoft.com/office/2006/metadata/contentType"/>
@@ -11061,23 +11093,4 @@
     <ds:schemaRef ds:uri="http://schemas.microsoft.com/internal/obd"/>
   </ds:schemaRefs>
 </ds:datastoreItem>
-</file>
-
-<file path=customXml/itemProps2.xml><?xml version="1.0" encoding="utf-8"?>
-<ds:datastoreItem xmlns:ds="http://schemas.openxmlformats.org/officeDocument/2006/customXml" ds:itemID="{CB7613A1-A0CB-4E22-AF85-27793339D14D}">
-  <ds:schemaRefs>
-    <ds:schemaRef ds:uri="http://schemas.microsoft.com/office/2006/metadata/properties"/>
-    <ds:schemaRef ds:uri="http://schemas.microsoft.com/office/infopath/2007/PartnerControls"/>
-    <ds:schemaRef ds:uri="e5b1cd33-4eca-41a4-b7d8-fdf3e6200119"/>
-    <ds:schemaRef ds:uri="c710a95f-4097-48d0-b72e-528dcf24b561"/>
-  </ds:schemaRefs>
-</ds:datastoreItem>
-</file>
-
-<file path=customXml/itemProps3.xml><?xml version="1.0" encoding="utf-8"?>
-<ds:datastoreItem xmlns:ds="http://schemas.openxmlformats.org/officeDocument/2006/customXml" ds:itemID="{A5ED3DFB-4F39-4BF8-995C-27FE2C86527B}">
-  <ds:schemaRefs>
-    <ds:schemaRef ds:uri="http://schemas.microsoft.com/sharepoint/v3/contenttype/forms"/>
-  </ds:schemaRefs>
-</ds:datastoreItem>
 </file>
</xml_diff>